<commit_message>
Update: SOW and Scripts
Updated SOW to have estimated hours and start dates

Added a scripts folder containing a .ipynb notebook for the crime analysis
</commit_message>
<xml_diff>
--- a/Documents/Statement of Work.docx
+++ b/Documents/Statement of Work.docx
@@ -425,22 +425,7 @@
               <w:cnfStyle w:val="000000000000" w:firstRow="0" w:lastRow="0" w:firstColumn="0" w:lastColumn="0" w:oddVBand="0" w:evenVBand="0" w:oddHBand="0" w:evenHBand="0" w:firstRowFirstColumn="0" w:firstRowLastColumn="0" w:lastRowFirstColumn="0" w:lastRowLastColumn="0"/>
             </w:pPr>
             <w:r>
-              <w:t xml:space="preserve">The pipeline will make use of 3 publicly available databases - </w:t>
-            </w:r>
-            <w:r>
-              <w:t>Population sizes by police force area (ONS)</w:t>
-            </w:r>
-            <w:r>
-              <w:t>;</w:t>
-            </w:r>
-            <w:r>
-              <w:t xml:space="preserve"> Crime Severity Score (ONS)</w:t>
-            </w:r>
-            <w:r>
-              <w:t>;</w:t>
-            </w:r>
-            <w:r>
-              <w:t xml:space="preserve"> Deprivation / IMD (gov.uk).</w:t>
+              <w:t>The pipeline will make use of 3 publicly available databases - Population sizes by police force area (ONS); Crime Severity Score (ONS); Deprivation / IMD (gov.uk).</w:t>
             </w:r>
             <w:r>
               <w:t xml:space="preserve"> No more databases will be used.</w:t>
@@ -807,6 +792,9 @@
             <w:pPr>
               <w:cnfStyle w:val="000000000000" w:firstRow="0" w:lastRow="0" w:firstColumn="0" w:lastColumn="0" w:oddVBand="0" w:evenVBand="0" w:oddHBand="0" w:evenHBand="0" w:firstRowFirstColumn="0" w:firstRowLastColumn="0" w:lastRowFirstColumn="0" w:lastRowLastColumn="0"/>
             </w:pPr>
+            <w:r>
+              <w:t>13/05/26</w:t>
+            </w:r>
           </w:p>
         </w:tc>
         <w:tc>
@@ -883,6 +871,9 @@
             <w:pPr>
               <w:cnfStyle w:val="000000100000" w:firstRow="0" w:lastRow="0" w:firstColumn="0" w:lastColumn="0" w:oddVBand="0" w:evenVBand="0" w:oddHBand="1" w:evenHBand="0" w:firstRowFirstColumn="0" w:firstRowLastColumn="0" w:lastRowFirstColumn="0" w:lastRowLastColumn="0"/>
             </w:pPr>
+            <w:r>
+              <w:t>18/05/26</w:t>
+            </w:r>
           </w:p>
         </w:tc>
         <w:tc>
@@ -958,6 +949,9 @@
             <w:pPr>
               <w:cnfStyle w:val="000000000000" w:firstRow="0" w:lastRow="0" w:firstColumn="0" w:lastColumn="0" w:oddVBand="0" w:evenVBand="0" w:oddHBand="0" w:evenHBand="0" w:firstRowFirstColumn="0" w:firstRowLastColumn="0" w:lastRowFirstColumn="0" w:lastRowLastColumn="0"/>
             </w:pPr>
+            <w:r>
+              <w:t>19/05/26</w:t>
+            </w:r>
           </w:p>
         </w:tc>
         <w:tc>
@@ -1042,6 +1036,9 @@
             <w:pPr>
               <w:cnfStyle w:val="000000100000" w:firstRow="0" w:lastRow="0" w:firstColumn="0" w:lastColumn="0" w:oddVBand="0" w:evenVBand="0" w:oddHBand="1" w:evenHBand="0" w:firstRowFirstColumn="0" w:firstRowLastColumn="0" w:lastRowFirstColumn="0" w:lastRowLastColumn="0"/>
             </w:pPr>
+            <w:r>
+              <w:t>19/05/26</w:t>
+            </w:r>
           </w:p>
         </w:tc>
         <w:tc>

</xml_diff>